<commit_message>
docs: atualiza documentação do projeto
</commit_message>
<xml_diff>
--- a/PFC_2026_Docs/Apêndice A - Gestão de Projetos/Business Case-Focinho Feliz.docx
+++ b/PFC_2026_Docs/Apêndice A - Gestão de Projetos/Business Case-Focinho Feliz.docx
@@ -4,25 +4,23 @@
   <w:body>
     <w:p>
       <w:pPr>
-        <w:pStyle w:val="Ttulo"/>
+        <w:pStyle w:val="Ttulo1"/>
         <w:jc w:val="center"/>
         <w:rPr>
           <w:rFonts w:ascii="Times New Roman" w:hAnsi="Times New Roman" w:cs="Times New Roman"/>
           <w:b/>
           <w:bCs/>
-          <w:color w:val="FF0066"/>
-          <w:sz w:val="40"/>
-          <w:szCs w:val="40"/>
-        </w:rPr>
-      </w:pPr>
-      <w:r>
-        <w:rPr>
-          <w:rFonts w:ascii="Times New Roman" w:hAnsi="Times New Roman" w:cs="Times New Roman"/>
-          <w:b/>
-          <w:bCs/>
-          <w:color w:val="FF0066"/>
-          <w:sz w:val="40"/>
-          <w:szCs w:val="40"/>
+          <w:sz w:val="48"/>
+          <w:szCs w:val="48"/>
+        </w:rPr>
+      </w:pPr>
+      <w:r>
+        <w:rPr>
+          <w:rFonts w:ascii="Times New Roman" w:hAnsi="Times New Roman" w:cs="Times New Roman"/>
+          <w:b/>
+          <w:bCs/>
+          <w:sz w:val="48"/>
+          <w:szCs w:val="48"/>
         </w:rPr>
         <w:t>Business Case</w:t>
       </w:r>
@@ -31,11 +29,32 @@
           <w:rFonts w:ascii="Times New Roman" w:hAnsi="Times New Roman" w:cs="Times New Roman"/>
           <w:b/>
           <w:bCs/>
-          <w:color w:val="FF0066"/>
-          <w:sz w:val="40"/>
-          <w:szCs w:val="40"/>
-        </w:rPr>
-        <w:t xml:space="preserve"> – Focinho Feliz</w:t>
+          <w:sz w:val="48"/>
+          <w:szCs w:val="48"/>
+        </w:rPr>
+        <w:t xml:space="preserve"> – </w:t>
+      </w:r>
+      <w:proofErr w:type="spellStart"/>
+      <w:r>
+        <w:rPr>
+          <w:rFonts w:ascii="Times New Roman" w:hAnsi="Times New Roman" w:cs="Times New Roman"/>
+          <w:b/>
+          <w:bCs/>
+          <w:sz w:val="48"/>
+          <w:szCs w:val="48"/>
+        </w:rPr>
+        <w:t>Focinho</w:t>
+      </w:r>
+      <w:proofErr w:type="spellEnd"/>
+      <w:r>
+        <w:rPr>
+          <w:rFonts w:ascii="Times New Roman" w:hAnsi="Times New Roman" w:cs="Times New Roman"/>
+          <w:b/>
+          <w:bCs/>
+          <w:sz w:val="48"/>
+          <w:szCs w:val="48"/>
+        </w:rPr>
+        <w:t xml:space="preserve"> Feliz</w:t>
       </w:r>
     </w:p>
     <w:p>
@@ -426,15 +445,27 @@
         </w:rPr>
         <w:t xml:space="preserve">    </w:t>
       </w:r>
-      <w:r>
-        <w:rPr>
-          <w:rFonts w:ascii="Times New Roman" w:hAnsi="Times New Roman" w:cs="Times New Roman"/>
-          <w:b/>
-          <w:bCs/>
-          <w:sz w:val="24"/>
-          <w:szCs w:val="24"/>
-        </w:rPr>
-        <w:t>Assinatura:</w:t>
+      <w:proofErr w:type="spellStart"/>
+      <w:r>
+        <w:rPr>
+          <w:rFonts w:ascii="Times New Roman" w:hAnsi="Times New Roman" w:cs="Times New Roman"/>
+          <w:b/>
+          <w:bCs/>
+          <w:sz w:val="24"/>
+          <w:szCs w:val="24"/>
+        </w:rPr>
+        <w:t>Assinatura</w:t>
+      </w:r>
+      <w:proofErr w:type="spellEnd"/>
+      <w:r>
+        <w:rPr>
+          <w:rFonts w:ascii="Times New Roman" w:hAnsi="Times New Roman" w:cs="Times New Roman"/>
+          <w:b/>
+          <w:bCs/>
+          <w:sz w:val="24"/>
+          <w:szCs w:val="24"/>
+        </w:rPr>
+        <w:t>:</w:t>
       </w:r>
     </w:p>
     <w:bookmarkEnd w:id="0"/>
@@ -1092,6 +1123,7 @@
   <w:style w:type="character" w:default="1" w:styleId="Fontepargpadro">
     <w:name w:val="Default Paragraph Font"/>
     <w:uiPriority w:val="1"/>
+    <w:semiHidden/>
     <w:unhideWhenUsed/>
   </w:style>
   <w:style w:type="table" w:default="1" w:styleId="Tabelanormal">
@@ -1243,6 +1275,45 @@
     <w:rsid w:val="008E40F0"/>
     <w:rPr>
       <w:rFonts w:eastAsiaTheme="minorEastAsia"/>
+      <w:sz w:val="21"/>
+      <w:szCs w:val="21"/>
+      <w:lang w:val="en-US"/>
+    </w:rPr>
+  </w:style>
+  <w:style w:type="paragraph" w:styleId="CitaoIntensa">
+    <w:name w:val="Intense Quote"/>
+    <w:basedOn w:val="Normal"/>
+    <w:next w:val="Normal"/>
+    <w:link w:val="CitaoIntensaChar"/>
+    <w:uiPriority w:val="30"/>
+    <w:qFormat/>
+    <w:rsid w:val="00E478B4"/>
+    <w:pPr>
+      <w:pBdr>
+        <w:top w:val="single" w:sz="4" w:space="10" w:color="5B9BD5" w:themeColor="accent1"/>
+        <w:bottom w:val="single" w:sz="4" w:space="10" w:color="5B9BD5" w:themeColor="accent1"/>
+      </w:pBdr>
+      <w:spacing w:before="360" w:after="360"/>
+      <w:ind w:left="864" w:right="864"/>
+      <w:jc w:val="center"/>
+    </w:pPr>
+    <w:rPr>
+      <w:i/>
+      <w:iCs/>
+      <w:color w:val="5B9BD5" w:themeColor="accent1"/>
+    </w:rPr>
+  </w:style>
+  <w:style w:type="character" w:customStyle="1" w:styleId="CitaoIntensaChar">
+    <w:name w:val="Citação Intensa Char"/>
+    <w:basedOn w:val="Fontepargpadro"/>
+    <w:link w:val="CitaoIntensa"/>
+    <w:uiPriority w:val="30"/>
+    <w:rsid w:val="00E478B4"/>
+    <w:rPr>
+      <w:rFonts w:eastAsiaTheme="minorEastAsia"/>
+      <w:i/>
+      <w:iCs/>
+      <w:color w:val="5B9BD5" w:themeColor="accent1"/>
       <w:sz w:val="21"/>
       <w:szCs w:val="21"/>
       <w:lang w:val="en-US"/>

</xml_diff>